<commit_message>
Add Indonesian JuTISI journal manuscript; fix species count and citation order in earlier drafts
Co-Authored-By: Claude Sonnet 5.5 <noreply@anthropic.com>
Claude-Session: https://claude.ai/code/session_018kaCqpGg13qJSgLKeAtD5g
</commit_message>
<xml_diff>
--- a/docs/jurnal/Journal_ITJRD_Juliana_Sari_YOLOv8_Fish_Classification_EN.docx
+++ b/docs/jurnal/Journal_ITJRD_Juliana_Sari_YOLOv8_Fish_Classification_EN.docx
@@ -440,7 +440,7 @@
                 <w:iCs/>
                 <w:color w:val="000000"/>
               </w:rPr>
-              <w:t xml:space="preserve">Small-scale fishers in Lhokseumawe recorded catch species by eye, which caused recording errors between similar species. This study built Fish Scan, an Android application that classified six catch species with YOLOv8. We collected 350 primary images in seven categories, including a Non Fish class, and expanded them to 768 images through Roboflow augmentation. We trained YOLOv8s for 100 epochs and converted the best weights to TensorFlow Lite for offline, on-device inference in Flutter. A dual confidence threshold dropped detections below 0.40, labeled detections from 0.40 to below 0.65 as Non Fish, and assigned a species label at 0.65 or higher. On validation data, the model reached 92.1% precision, 95.5% recall, 93.8% F1-score, 93.1% mAP50, and 86.3% mAP50-95. A manual check on 32 test images gave 97.3% recall but 67.9% precision, because the model marked 33 background regions as skipjack tuna. All 21 black-box test cases passed. The results showed that YOLOv8 on TensorFlow Lite ran offline on a mid-range Android phone and supported catch recording for small-scale fishers.</w:t>
+              <w:t xml:space="preserve">Small-scale fishers in Lhokseumawe recorded catch species by eye, which caused recording errors between similar species. This study built Fish Scan, an Android application that classified six catch species with YOLOv8. We collected 350 primary images in seven categories, including a Non Fish class, and expanded them to 768 images through Roboflow augmentation. We trained YOLOv8s for 100 epochs and converted the best weights to TensorFlow Lite for offline, on-device inference in Flutter. A dual confidence threshold dropped detections below 0.40, labeled detections from 0.40 to below 0.65 as Non Fish, and assigned a species label at 0.65 or higher. On validation data, the model reached 92.1% precision, 95.5% recall, 93.8% F1-score, 93.1% mAP50, and 86.3% mAP50-95. A manual check on 32 test images gave 97.3% recall but 67.9% precision, because the model marked 33 background regions as skipjack tuna. All 21 black-box test cases passed. The results showed that YOLOv8 on TensorFlow Lite ran offline on a phone that is not high-end and supported catch recording for small-scale fishers.</w:t>
             </w:r>
           </w:p>
         </w:tc>
@@ -803,7 +803,7 @@
           <w:sz w:val="22"/>
           <w:szCs w:val="22"/>
         </w:rPr>
-        <w:t xml:space="preserve">Indonesia has large marine fishery resources. The Ministry of Marine Affairs and Fisheries reported a national fish consumption of 56.39 kg per capita in 2020, up 3.47% from the previous year. In Lhokseumawe City, 2025 data from Statistics Indonesia (BPS) list 25 marine catch species. Eastern little tuna had the highest volume at 1,476,032 kg, followed by Indian mackerel at 952,496 kg and anchovy at 825,700 kg.</w:t>
+        <w:t xml:space="preserve">Indonesia has large marine fishery resources. The Ministry of Marine Affairs and Fisheries reported a national fish consumption of 56.39 kg per capita in 2020, up 3.47% from the previous year. In Lhokseumawe City, 2025 data from Statistics Indonesia (BPS) list 15 marine catch species with a total of 6,007,566 kg. Eastern little tuna had the highest volume at 1,476,032 kg, followed by Indian mackerel at 952,496 kg and anchovy at 825,700 kg.</w:t>
       </w:r>
     </w:p>
     <w:p>
@@ -1189,7 +1189,7 @@
           <w:sz w:val="22"/>
           <w:szCs w:val="22"/>
         </w:rPr>
-        <w:t xml:space="preserve">We labeled each fish with a bounding box in Roboflow using the YOLO format. Non Fish images received no box, so they served as negative background images. Figure 2 shows sample annotations. Preprocessing applied auto-orient to remove EXIF rotation and resized each image to 512 × 512 pixels with the stretch method.</w:t>
+        <w:t xml:space="preserve">We labeled each fish with a bounding box in Roboflow using the YOLO format. Non Fish images received no box, so they served as negative background images. Figure 2 shows sample annotations. Preprocessing applied auto-orient to remove EXIF rotation and resized each image to 512 × 512 pixels with the stretch method [17].</w:t>
       </w:r>
     </w:p>
     <w:p>
@@ -1669,7 +1669,7 @@
           <w:sz w:val="22"/>
           <w:szCs w:val="22"/>
         </w:rPr>
-        <w:t xml:space="preserve">YOLOv8 has three parts: backbone, neck, and head [17]. The backbone extracts features with C2f modules. The neck fuses multiscale features through PAN-FPN. The head predicts classes and box coordinates separately without anchor boxes. We chose the YOLOv8s variant because it is light enough for mobile devices. We trained the model on Google Colab with a GPU, starting from the yolov8s.pt pretrained weights. Table 2 lists the main parameters. Training took about 1,608 seconds. We then exported the best weights (best.pt) to best.tflite.</w:t>
+        <w:t xml:space="preserve">YOLOv8 has three parts: backbone, neck, and head [18]. The backbone extracts features with C2f modules. The neck fuses multiscale features through PAN-FPN. The head predicts classes and box coordinates separately without anchor boxes. We chose the YOLOv8s variant because it is light enough for mobile devices. We trained the model on Google Colab with a GPU, starting from the yolov8s.pt pretrained weights. Table 2 lists the main parameters. Training took about 1,608 seconds. We then exported the best weights (best.pt) to best.tflite.</w:t>
       </w:r>
     </w:p>
     <w:p>
@@ -2346,7 +2346,7 @@
           <w:sz w:val="22"/>
           <w:szCs w:val="22"/>
         </w:rPr>
-        <w:t xml:space="preserve">We measured performance with IoU, precision, recall, F1-score, and mAP [18]. IoU compares the predicted box with the ground truth box, as in (1). A prediction with IoU above the threshold counts as a true positive (TP).</w:t>
+        <w:t xml:space="preserve">We measured performance with IoU, precision, recall, F1-score, and mAP [10]. IoU compares the predicted box with the ground truth box, as in (1). A prediction with IoU above the threshold counts as a true positive (TP).</w:t>
       </w:r>
     </w:p>
     <w:tbl>
@@ -6898,7 +6898,22 @@
           <w:sz w:val="18"/>
           <w:szCs w:val="18"/>
         </w:rPr>
-        <w:t xml:space="preserve">[17]	R. Varghese and S. M., “YOLOv8: A novel object detection algorithm with enhanced performance and robustness,” IEEE, 2024.</w:t>
+        <w:t xml:space="preserve">[17]	M. U. Nasution, L. S. Harahap, and F. Syakbani, “Tinjauan metode pengolahan citra digital untuk deteksi objek otomatis,” </w:t>
+      </w:r>
+      <w:r>
+        <w:rPr>
+          <w:sz w:val="18"/>
+          <w:szCs w:val="18"/>
+          <w:i/>
+        </w:rPr>
+        <w:t xml:space="preserve">Jurnal Informatika dan Teknik Elektro Terapan</w:t>
+      </w:r>
+      <w:r>
+        <w:rPr>
+          <w:sz w:val="18"/>
+          <w:szCs w:val="18"/>
+        </w:rPr>
+        <w:t xml:space="preserve">, vol. 13, no. 3, Jul. 2025, doi: 10.23960/jitet.v13i3.7135.</w:t>
       </w:r>
     </w:p>
     <w:p>
@@ -6913,22 +6928,7 @@
           <w:sz w:val="18"/>
           <w:szCs w:val="18"/>
         </w:rPr>
-        <w:t xml:space="preserve">[18]	M. U. Nasution, L. S. Harahap, and F. Syakbani, “Tinjauan metode pengolahan citra digital untuk deteksi objek otomatis,” </w:t>
-      </w:r>
-      <w:r>
-        <w:rPr>
-          <w:sz w:val="18"/>
-          <w:szCs w:val="18"/>
-          <w:i/>
-        </w:rPr>
-        <w:t xml:space="preserve">Jurnal Informatika dan Teknik Elektro Terapan</w:t>
-      </w:r>
-      <w:r>
-        <w:rPr>
-          <w:sz w:val="18"/>
-          <w:szCs w:val="18"/>
-        </w:rPr>
-        <w:t xml:space="preserve">, vol. 13, no. 3, Jul. 2025, doi: 10.23960/jitet.v13i3.7135.</w:t>
+        <w:t xml:space="preserve">[18]	R. Varghese and S. M., “YOLOv8: A novel object detection algorithm with enhanced performance and robustness,” IEEE, 2024.</w:t>
       </w:r>
     </w:p>
     <w:p>

</xml_diff>